<commit_message>
docs: simplificar variaveis de ambiente no guia de instalacao
Supabase e Gemini ja sao a mesma conta em uso desde o inicio, entao os
valores nao precisam ser buscados em painel nenhum - sao os mesmos ja
em producao, so mudando onde o site fica hospedado.
</commit_message>
<xml_diff>
--- a/docs/guia-de-instalacao-scal.docx
+++ b/docs/guia-de-instalacao-scal.docx
@@ -492,7 +492,7 @@
             </w:pPr>
             <w:r>
               <w:rPr/>
-              <w:t xml:space="preserve">Onde conseguir o valor</w:t>
+              <w:t xml:space="preserve">Valor</w:t>
             </w:r>
           </w:p>
         </w:tc>
@@ -541,7 +541,7 @@
             </w:pPr>
             <w:r>
               <w:rPr/>
-              <w:t xml:space="preserve">Painel do Supabase → Settings → API → "Project URL"</w:t>
+              <w:t xml:space="preserve">Já é o mesmo Supabase que está em uso — quem te passou este material te envia esse valor pronto</w:t>
             </w:r>
           </w:p>
         </w:tc>
@@ -586,7 +586,7 @@
             </w:pPr>
             <w:r>
               <w:rPr/>
-              <w:t xml:space="preserve">Painel do Supabase → Settings → API → "anon public"</w:t>
+              <w:t xml:space="preserve">Idem — valor já em uso, é só colar o que foi te passado</w:t>
             </w:r>
           </w:p>
         </w:tc>
@@ -631,7 +631,7 @@
             </w:pPr>
             <w:r>
               <w:rPr/>
-              <w:t xml:space="preserve">Painel do Supabase → Settings → API → "service_role" (cuidado: essa é secreta, não compartilhar)</w:t>
+              <w:t xml:space="preserve">Idem — é secreta, não compartilhar com mais ninguém além de quem for mexer no sistema</w:t>
             </w:r>
           </w:p>
         </w:tc>
@@ -721,27 +721,7 @@
             </w:pPr>
             <w:r>
               <w:rPr/>
-              <w:t xml:space="preserve">Qualquer texto aleatório e longo (ex: peça pra alguém gerar com o comando </w:t>
-            </w:r>
-          </w:p>
-          <w:p>
-            <w:pPr>
-              <w:spacing w:lineRule="auto"/>
-            </w:pPr>
-            <w:r>
-              <w:rPr>
-                <w:highlight w:val="lightGray"/>
-              </w:rPr>
-              <w:t xml:space="preserve">openssl rand -hex 32</w:t>
-            </w:r>
-          </w:p>
-          <w:p>
-            <w:pPr>
-              <w:spacing w:lineRule="auto"/>
-            </w:pPr>
-            <w:r>
-              <w:rPr/>
-              <w:t xml:space="preserve">, ou use qualquer gerador de senha grande)</w:t>
+              <w:t xml:space="preserve">Valor já em uso, é só colar o que foi te passado (não precisa gerar um novo)</w:t>
             </w:r>
           </w:p>
         </w:tc>
@@ -786,7 +766,7 @@
             </w:pPr>
             <w:r>
               <w:rPr/>
-              <w:t xml:space="preserve">Mesma ideia acima — um texto aleatório e longo, guarde ele anotado</w:t>
+              <w:t xml:space="preserve">Valor já em uso, é só colar o que foi te passado (não precisa gerar um novo)</w:t>
             </w:r>
           </w:p>
         </w:tc>
@@ -908,6 +888,15 @@
       </w:pPr>
       <w:r>
         <w:rPr/>
+      </w:r>
+    </w:p>
+    <w:p>
+      <w:pPr>
+        <w:spacing w:lineRule="auto"/>
+      </w:pPr>
+      <w:r>
+        <w:rPr/>
+        <w:t xml:space="preserve">Como o banco de dados (Supabase) e a chave do Gemini já são os mesmos que o sistema já usa hoje, não é preciso ir atrás desses valores em nenhum painel — são os mesmos de sempre, só mudando onde o site fica hospedado.</w:t>
       </w:r>
     </w:p>
     <w:p>

</xml_diff>